<commit_message>
LaHaus: puntos 10-12 para Jaider (llamadas falsas, rescate = entrega, plantilla del correo); base reglas 11-12
</commit_message>
<xml_diff>
--- a/recursos/comercial/plataforma LaHaus/AJUSTES_CONFIGURACION_JAIDER_2026-10-07.docx
+++ b/recursos/comercial/plataforma LaHaus/AJUSTES_CONFIGURACION_JAIDER_2026-10-07.docx
@@ -46,7 +46,7 @@
           <w:i w:val="0"/>
           <w:sz w:val="21"/>
         </w:rPr>
-        <w:t>Jaider, gracias por la reunión. Te dejo por escrito los ocho ajustes de configuración, cada uno con el lead donde lo vimos, para que me confirmes fecha de cada uno:</w:t>
+        <w:t>Jaider, gracias por la reunión. Te dejo por escrito los doce ajustes de configuración, cada uno con el lead donde lo vimos, para que me confirmes fecha de cada uno:</w:t>
       </w:r>
     </w:p>
     <w:p>
@@ -86,7 +86,7 @@
           <w:color w:val="666666"/>
           <w:sz w:val="19"/>
         </w:rPr>
-        <w:t>Ejemplo: Yarhi (4/10): después de la jornada recibió precio + decisor y se fue sin que le ofrecieran cita. Jaime Pérez (6/10, 7:53 pm): decisor antes de la cita, ya con la base nueva. Henry (6/10, 8:09 pm): igual.</w:t>
+        <w:t>Ejemplo: Yarhi (4/10): después de la jornada recibió precio + decisor y se fue sin que le ofrecieran cita. Jaime Pérez (6/10, 7:53 pm): decisor antes de la cita, ya con la base nueva. Henry (6/10, 8:09 pm): igual. Fernanda (7/10, 7:22 pm): soltó los dos precios sin que los pidiera y preguntó el decisor por segunda vez, en tres mensajes en el mismo minuto.</w:t>
       </w:r>
     </w:p>
     <w:p>
@@ -206,7 +206,7 @@
           <w:color w:val="666666"/>
           <w:sz w:val="19"/>
         </w:rPr>
-        <w:t>Ejemplo: D🪐z (6/10): sin respuesta desde las 8:33, recibió cuatro preguntas distintas en 70 minutos (nombre → para quién → nivel → jornada). Adriana (5/10): tres preguntas apiladas. Gema (5/10): dos distintas y respondió "no entiendo la pregunta". Vanessa (5-6/10): cuatro seguidas.</w:t>
+        <w:t>Ejemplo: D🪐z (6/10): sin respuesta desde las 8:33, recibió cuatro preguntas distintas en 70 minutos (nombre → para quién → nivel → jornada). Adriana (5/10): tres preguntas apiladas. Gema (5/10): dos distintas y respondió "no entiendo la pregunta". Vanessa (5-6/10): cuatro seguidas. Fernanda (7/10): callada de 2:22 a 7:21 pm y recibió decisor, Cajasan y "¿quieres conocer cuál programa?", tres preguntas distintas; su "No señora" fue a la tercera.</w:t>
       </w:r>
     </w:p>
     <w:p>
@@ -326,7 +326,7 @@
           <w:color w:val="666666"/>
           <w:sz w:val="19"/>
         </w:rPr>
-        <w:t>Ejemplo: Henry y Jaime Pérez (6/10, 7:23 y 7:46 pm) siguieron recibiendo "el Arranque de octubre". Adriana (4/10): llegó por Au Pair, el agente asumió que viajaba ella y era la mamá de una joven de 18.</w:t>
+        <w:t>Ejemplo: Henry y Jaime Pérez (6/10) y Fernanda (7/10, 1:45 pm) siguieron recibiendo "el Arranque de octubre". Adriana (4/10): llegó por Au Pair, el agente asumió que viajaba ella y era la mamá de una joven de 18.</w:t>
       </w:r>
     </w:p>
     <w:p>
@@ -367,6 +367,166 @@
           <w:sz w:val="19"/>
         </w:rPr>
         <w:t>Ejemplo: Datos: en 9 días Meta entregó 59 leads de formulario y 19 conversaciones de WhatsApp; la reactivación tuvo tres respuestas en menos de 20 minutos el 6/10 (Claudia, Jerson, Alexandra).</w:t>
+      </w:r>
+    </w:p>
+    <w:p>
+      <w:pPr>
+        <w:spacing w:after="20"/>
+      </w:pPr>
+      <w:r>
+        <w:rPr>
+          <w:b/>
+          <w:i w:val="0"/>
+          <w:sz w:val="21"/>
+        </w:rPr>
+        <w:t>9. Las preguntas de perfilación se dan por respondidas cuando el cliente ya las contestó por su cuenta.</w:t>
+      </w:r>
+    </w:p>
+    <w:p>
+      <w:pPr>
+        <w:spacing w:after="20"/>
+      </w:pPr>
+      <w:r>
+        <w:rPr>
+          <w:b w:val="0"/>
+          <w:i w:val="0"/>
+          <w:sz w:val="21"/>
+        </w:rPr>
+        <w:t>Si el cliente dice algo que responde una pregunta que aún no se le ha hecho, el agente no la hace. Si la plataforma obliga a "hacer" cada pregunta, el agente sigue preguntando lo que ya sabe.</w:t>
+      </w:r>
+    </w:p>
+    <w:p>
+      <w:pPr>
+        <w:spacing w:after="160"/>
+      </w:pPr>
+      <w:r>
+        <w:rPr>
+          <w:b w:val="0"/>
+          <w:i/>
+          <w:color w:val="666666"/>
+          <w:sz w:val="19"/>
+        </w:rPr>
+        <w:t>Ejemplo: Lead del 7/10: escribió "quiero reforzar lo que ya sé" (es para él y tiene nivel) y el agente le preguntó "¿el curso es para ti o para alguien más?".</w:t>
+      </w:r>
+    </w:p>
+    <w:p>
+      <w:pPr>
+        <w:spacing w:after="20"/>
+      </w:pPr>
+      <w:r>
+        <w:rPr>
+          <w:b/>
+          <w:i w:val="0"/>
+          <w:sz w:val="21"/>
+        </w:rPr>
+        <w:t>10. El agente nunca dice que llamó ni que hizo algo fuera del chat.</w:t>
+      </w:r>
+    </w:p>
+    <w:p>
+      <w:pPr>
+        <w:spacing w:after="20"/>
+      </w:pPr>
+      <w:r>
+        <w:rPr>
+          <w:b w:val="0"/>
+          <w:i w:val="0"/>
+          <w:sz w:val="21"/>
+        </w:rPr>
+        <w:t>Si existe una función de llamada automática, necesito saber cuándo se dispara y si realmente marca; si no existe, la plantilla "te llamé hace un momento pero no pude comunicarme" hay que eliminarla.</w:t>
+      </w:r>
+    </w:p>
+    <w:p>
+      <w:pPr>
+        <w:spacing w:after="160"/>
+      </w:pPr>
+      <w:r>
+        <w:rPr>
+          <w:b w:val="0"/>
+          <w:i/>
+          <w:color w:val="666666"/>
+          <w:sz w:val="19"/>
+        </w:rPr>
+        <w:t>Ejemplo: María Eugenia (lead, 6/10 9:23 am y 11:31 am): "te llamé hace un momento pero no pude comunicarme contigo", dos veces, sin que nadie la llamara.</w:t>
+      </w:r>
+    </w:p>
+    <w:p>
+      <w:pPr>
+        <w:spacing w:after="20"/>
+      </w:pPr>
+      <w:r>
+        <w:rPr>
+          <w:b/>
+          <w:i w:val="0"/>
+          <w:sz w:val="21"/>
+        </w:rPr>
+        <w:t>11. La línea de rescate es un estado de entrega: notificación a la asesora y el agente se detiene.</w:t>
+      </w:r>
+    </w:p>
+    <w:p>
+      <w:pPr>
+        <w:spacing w:after="20"/>
+      </w:pPr>
+      <w:r>
+        <w:rPr>
+          <w:b w:val="0"/>
+          <w:i w:val="0"/>
+          <w:sz w:val="21"/>
+        </w:rPr>
+        <w:t>Cuando el agente responde "Te entiendo. Déjame que la asesora te escriba hoy…", no debe seguir con más preguntas ni ofertas hasta que la asesora actúe o el cliente escriba.</w:t>
+      </w:r>
+    </w:p>
+    <w:p>
+      <w:pPr>
+        <w:spacing w:after="160"/>
+      </w:pPr>
+      <w:r>
+        <w:rPr>
+          <w:b w:val="0"/>
+          <w:i/>
+          <w:color w:val="666666"/>
+          <w:sz w:val="19"/>
+        </w:rPr>
+        <w:t>Ejemplo: María Eugenia (lead, 7/10 12:34 pm): dijo la línea de rescate y después mandó cinco mensajes más en seis horas (correo, Arranque, Cajasan, "¿te gustaría saber…?").</w:t>
+      </w:r>
+    </w:p>
+    <w:p>
+      <w:pPr>
+        <w:spacing w:after="20"/>
+      </w:pPr>
+      <w:r>
+        <w:rPr>
+          <w:b/>
+          <w:i w:val="0"/>
+          <w:sz w:val="21"/>
+        </w:rPr>
+        <w:t>12. La plantilla de la pregunta del correo no puede decir "para dejar tu registro al día".</w:t>
+      </w:r>
+    </w:p>
+    <w:p>
+      <w:pPr>
+        <w:spacing w:after="20"/>
+      </w:pPr>
+      <w:r>
+        <w:rPr>
+          <w:b w:val="0"/>
+          <w:i w:val="0"/>
+          <w:sz w:val="21"/>
+        </w:rPr>
+        <w:t>Esa frase está prohibida desde el 30/09 y no está en nuestro documento: vive en la plantilla de la plataforma. El correo se pide solo al confirmar la cita, con su razón real ("para confirmarte la cita").</w:t>
+      </w:r>
+    </w:p>
+    <w:p>
+      <w:pPr>
+        <w:spacing w:after="160"/>
+      </w:pPr>
+      <w:r>
+        <w:rPr>
+          <w:b w:val="0"/>
+          <w:i/>
+          <w:color w:val="666666"/>
+          <w:sz w:val="19"/>
+        </w:rPr>
+        <w:t>Ejemplo: María Eugenia (lead, 7/10 12:28 pm) y varios más esta semana.</w:t>
       </w:r>
     </w:p>
     <w:p>

</xml_diff>

<commit_message>
LaHaus: el agente si hace llamadas (retirado punto 10 y regla); 11 puntos para Jaider
</commit_message>
<xml_diff>
--- a/recursos/comercial/plataforma LaHaus/AJUSTES_CONFIGURACION_JAIDER_2026-10-07.docx
+++ b/recursos/comercial/plataforma LaHaus/AJUSTES_CONFIGURACION_JAIDER_2026-10-07.docx
@@ -46,7 +46,7 @@
           <w:i w:val="0"/>
           <w:sz w:val="21"/>
         </w:rPr>
-        <w:t>Jaider, gracias por la reunión. Te dejo por escrito los doce ajustes de configuración, cada uno con el lead donde lo vimos, para que me confirmes fecha de cada uno:</w:t>
+        <w:t>Jaider, gracias por la reunión. Te dejo por escrito los once ajustes de configuración, cada uno con el lead donde lo vimos, para que me confirmes fecha de cada uno:</w:t>
       </w:r>
     </w:p>
     <w:p>
@@ -419,47 +419,7 @@
           <w:i w:val="0"/>
           <w:sz w:val="21"/>
         </w:rPr>
-        <w:t>10. El agente nunca dice que llamó ni que hizo algo fuera del chat.</w:t>
-      </w:r>
-    </w:p>
-    <w:p>
-      <w:pPr>
-        <w:spacing w:after="20"/>
-      </w:pPr>
-      <w:r>
-        <w:rPr>
-          <w:b w:val="0"/>
-          <w:i w:val="0"/>
-          <w:sz w:val="21"/>
-        </w:rPr>
-        <w:t>Si existe una función de llamada automática, necesito saber cuándo se dispara y si realmente marca; si no existe, la plantilla "te llamé hace un momento pero no pude comunicarme" hay que eliminarla.</w:t>
-      </w:r>
-    </w:p>
-    <w:p>
-      <w:pPr>
-        <w:spacing w:after="160"/>
-      </w:pPr>
-      <w:r>
-        <w:rPr>
-          <w:b w:val="0"/>
-          <w:i/>
-          <w:color w:val="666666"/>
-          <w:sz w:val="19"/>
-        </w:rPr>
-        <w:t>Ejemplo: María Eugenia (lead, 6/10 9:23 am y 11:31 am): "te llamé hace un momento pero no pude comunicarme contigo", dos veces, sin que nadie la llamara.</w:t>
-      </w:r>
-    </w:p>
-    <w:p>
-      <w:pPr>
-        <w:spacing w:after="20"/>
-      </w:pPr>
-      <w:r>
-        <w:rPr>
-          <w:b/>
-          <w:i w:val="0"/>
-          <w:sz w:val="21"/>
-        </w:rPr>
-        <w:t>11. La línea de rescate es un estado de entrega: notificación a la asesora y el agente se detiene.</w:t>
+        <w:t>10. La línea de rescate es un estado de entrega: notificación a la asesora y el agente se detiene.</w:t>
       </w:r>
     </w:p>
     <w:p>
@@ -499,7 +459,7 @@
           <w:i w:val="0"/>
           <w:sz w:val="21"/>
         </w:rPr>
-        <w:t>12. La plantilla de la pregunta del correo no puede decir "para dejar tu registro al día".</w:t>
+        <w:t>11. La plantilla de la pregunta del correo no puede decir "para dejar tu registro al día".</w:t>
       </w:r>
     </w:p>
     <w:p>

</xml_diff>

<commit_message>
LaHaus: punto 12 (agrupar rafagas); cita 20-30 min en la base
</commit_message>
<xml_diff>
--- a/recursos/comercial/plataforma LaHaus/AJUSTES_CONFIGURACION_JAIDER_2026-10-07.docx
+++ b/recursos/comercial/plataforma LaHaus/AJUSTES_CONFIGURACION_JAIDER_2026-10-07.docx
@@ -46,7 +46,7 @@
           <w:i w:val="0"/>
           <w:sz w:val="21"/>
         </w:rPr>
-        <w:t>Jaider, gracias por la reunión. Te dejo por escrito los once ajustes de configuración, cada uno con el lead donde lo vimos, para que me confirmes fecha de cada uno:</w:t>
+        <w:t>Jaider, gracias por la reunión. Te dejo por escrito los doce ajustes de configuración, cada uno con el lead donde lo vimos, para que me confirmes fecha de cada uno:</w:t>
       </w:r>
     </w:p>
     <w:p>
@@ -491,6 +491,46 @@
     </w:p>
     <w:p>
       <w:pPr>
+        <w:spacing w:after="20"/>
+      </w:pPr>
+      <w:r>
+        <w:rPr>
+          <w:b/>
+          <w:i w:val="0"/>
+          <w:sz w:val="21"/>
+        </w:rPr>
+        <w:t>12. Agrupar los mensajes que el cliente manda en ráfaga y responder una sola vez.</w:t>
+      </w:r>
+    </w:p>
+    <w:p>
+      <w:pPr>
+        <w:spacing w:after="20"/>
+      </w:pPr>
+      <w:r>
+        <w:rPr>
+          <w:b w:val="0"/>
+          <w:i w:val="0"/>
+          <w:sz w:val="21"/>
+        </w:rPr>
+        <w:t>Muchos clientes escriben en fragmentos (tres o cuatro mensajes en el mismo minuto). El agente debería esperar 20-30 segundos y responder a todo junto; hoy contesta cada fragmento por separado y repite preguntas.</w:t>
+      </w:r>
+    </w:p>
+    <w:p>
+      <w:pPr>
+        <w:spacing w:after="160"/>
+      </w:pPr>
+      <w:r>
+        <w:rPr>
+          <w:b w:val="0"/>
+          <w:i/>
+          <w:color w:val="666666"/>
+          <w:sz w:val="19"/>
+        </w:rPr>
+        <w:t>Ejemplo: Sandra (7/10, 5:15-5:18 pm): fragmentos "Un viaje" / "Mi hija va a estudiar…" / "Quiero saber q costo tiene"; el agente mandó dos respuestas por minuto y preguntó la jornada tres veces. (Aun así agendó: viernes 9/10 11:00 am.)</w:t>
+      </w:r>
+    </w:p>
+    <w:p>
+      <w:pPr>
         <w:spacing w:after="120"/>
       </w:pPr>
       <w:r>

</xml_diff>

<commit_message>
LaHaus Jaider: plantilla del nombre (primer nombre) y cadencia unica escrita
</commit_message>
<xml_diff>
--- a/recursos/comercial/plataforma LaHaus/AJUSTES_CONFIGURACION_JAIDER_2026-10-07.docx
+++ b/recursos/comercial/plataforma LaHaus/AJUSTES_CONFIGURACION_JAIDER_2026-10-07.docx
@@ -192,7 +192,7 @@
           <w:i w:val="0"/>
           <w:sz w:val="21"/>
         </w:rPr>
-        <w:t>Los 5 toques en 24 horas para lead nuevo están bien. Reactivación: máximo 2 en 48 horas y 1 a los 7 días. Cuando el cliente responde, el contador se reinicia.</w:t>
+        <w:t>Cadencia única y escrita para lead nuevo: 10 min, 1 h, 4 h, mañana siguiente, tarde siguiente (hoy varía de un lead a otro: a unos cada 5 minutos, a otros cada 35). Reactivación: máximo 2 en 48 horas y 1 a los 7 días. Cuando el cliente responde, el contador se reinicia.</w:t>
       </w:r>
     </w:p>
     <w:p>
@@ -459,7 +459,7 @@
           <w:i w:val="0"/>
           <w:sz w:val="21"/>
         </w:rPr>
-        <w:t>11. La plantilla de la pregunta del correo no puede decir "para dejar tu registro al día".</w:t>
+        <w:t>11. Plantillas de datos del cliente: el correo no puede pedirse con "para dejar tu registro al día", y el nombre se pide como primer nombre, no "nombre completo".</w:t>
       </w:r>
     </w:p>
     <w:p>
@@ -472,7 +472,7 @@
           <w:i w:val="0"/>
           <w:sz w:val="21"/>
         </w:rPr>
-        <w:t>Esa frase está prohibida desde el 30/09 y no está en nuestro documento: vive en la plantilla de la plataforma. El correo se pide solo al confirmar la cita, con su razón real ("para confirmarte la cita").</w:t>
+        <w:t>La frase del correo está prohibida desde el 30/09 y no está en nuestro documento: vive en la plantilla de la plataforma; el correo se pide solo al confirmar la cita, con su razón real. La plantilla del nombre pregunta "¿cuál es tu nombre completo?" y luego el agente usa el nombre completo en cada mensaje; debe ser solo el primer nombre.</w:t>
       </w:r>
     </w:p>
     <w:p>
@@ -486,7 +486,7 @@
           <w:color w:val="666666"/>
           <w:sz w:val="19"/>
         </w:rPr>
-        <w:t>Ejemplo: María Eugenia (lead, 7/10 12:28 pm) y varios más esta semana.</w:t>
+        <w:t>Ejemplo: María Eugenia (lead, 7/10 12:28 pm) y varios más esta semana. Laura (6/10): "¿cuál es tu nombre completo?" y después "Laura Alejandra Guarin" en tres mensajes.</w:t>
       </w:r>
     </w:p>
     <w:p>

</xml_diff>

<commit_message>
LaHaus: ortografia correcta (base); confirmacion de llamada sin 'nos vemos' (Jaider 11)
</commit_message>
<xml_diff>
--- a/recursos/comercial/plataforma LaHaus/AJUSTES_CONFIGURACION_JAIDER_2026-10-07.docx
+++ b/recursos/comercial/plataforma LaHaus/AJUSTES_CONFIGURACION_JAIDER_2026-10-07.docx
@@ -459,7 +459,7 @@
           <w:i w:val="0"/>
           <w:sz w:val="21"/>
         </w:rPr>
-        <w:t>11. Plantillas de datos del cliente: el correo no puede pedirse con "para dejar tu registro al día", y el nombre se pide como primer nombre, no "nombre completo".</w:t>
+        <w:t>11. Plantillas: el correo no puede pedirse con "para dejar tu registro al día"; el nombre se pide como primer nombre, no "nombre completo"; y la confirmación de una cita por llamada o videollamada no puede decir "¡Nos vemos!" ni "Te esperamos".</w:t>
       </w:r>
     </w:p>
     <w:p>
@@ -486,7 +486,7 @@
           <w:color w:val="666666"/>
           <w:sz w:val="19"/>
         </w:rPr>
-        <w:t>Ejemplo: María Eugenia (lead, 7/10 12:28 pm) y varios más esta semana. Laura (6/10): "¿cuál es tu nombre completo?" y después "Laura Alejandra Guarin" en tres mensajes.</w:t>
+        <w:t>Ejemplo: María Eugenia (lead, 7/10 12:28 pm) y varios más esta semana. Laura (6/10): "¿cuál es tu nombre completo?" y después "Laura Alejandra Guarin" en tres mensajes. Vanesa Celis (7/10): cita por LLAMADA confirmada con "¡Nos vemos!" y "Te esperamos".</w:t>
       </w:r>
     </w:p>
     <w:p>

</xml_diff>

<commit_message>
LaHaus Jaider: punto 13 recordatorios de cita
</commit_message>
<xml_diff>
--- a/recursos/comercial/plataforma LaHaus/AJUSTES_CONFIGURACION_JAIDER_2026-10-07.docx
+++ b/recursos/comercial/plataforma LaHaus/AJUSTES_CONFIGURACION_JAIDER_2026-10-07.docx
@@ -46,7 +46,7 @@
           <w:i w:val="0"/>
           <w:sz w:val="21"/>
         </w:rPr>
-        <w:t>Jaider, gracias por la reunión. Te dejo por escrito los doce ajustes de configuración, cada uno con el lead donde lo vimos, para que me confirmes fecha de cada uno:</w:t>
+        <w:t>Jaider, gracias por la reunión. Te dejo por escrito los trece ajustes de configuración, cada uno con el lead donde lo vimos, para que me confirmes fecha de cada uno:</w:t>
       </w:r>
     </w:p>
     <w:p>
@@ -531,6 +531,46 @@
     </w:p>
     <w:p>
       <w:pPr>
+        <w:spacing w:after="20"/>
+      </w:pPr>
+      <w:r>
+        <w:rPr>
+          <w:b/>
+          <w:i w:val="0"/>
+          <w:sz w:val="21"/>
+        </w:rPr>
+        <w:t>13. Recordatorios de cita: dos como máximo, y ninguno antes de 12 horas después de agendar.</w:t>
+      </w:r>
+    </w:p>
+    <w:p>
+      <w:pPr>
+        <w:spacing w:after="20"/>
+      </w:pPr>
+      <w:r>
+        <w:rPr>
+          <w:b w:val="0"/>
+          <w:i w:val="0"/>
+          <w:sz w:val="21"/>
+        </w:rPr>
+        <w:t>Uno la noche anterior a las 7:00 pm (solo si la cita se agendó antes de ese día) y uno 60 minutos antes, con el enlace de la videollamada o "te llamamos a este número". Si la cita se agenda hoy para mañana, solo el de los 60 minutos.</w:t>
+      </w:r>
+    </w:p>
+    <w:p>
+      <w:pPr>
+        <w:spacing w:after="160"/>
+      </w:pPr>
+      <w:r>
+        <w:rPr>
+          <w:b w:val="0"/>
+          <w:i/>
+          <w:color w:val="666666"/>
+          <w:sz w:val="19"/>
+        </w:rPr>
+        <w:t>Ejemplo: Vanesa Celis (7/10): agendó a las 2:38 pm para el jueves 4:30 pm y a las 4:32 pm le llegó "tu asesor tiene todo listo… ¿todo bien de tu parte?", dos horas después de decir "ok" dos veces.</w:t>
+      </w:r>
+    </w:p>
+    <w:p>
+      <w:pPr>
         <w:spacing w:after="120"/>
       </w:pPr>
       <w:r>

</xml_diff>

<commit_message>
LaHaus: objecion de precio interrumpe la perfilacion (base + Jaider punto 1); bug de mensaje duplicado
</commit_message>
<xml_diff>
--- a/recursos/comercial/plataforma LaHaus/AJUSTES_CONFIGURACION_JAIDER_2026-10-07.docx
+++ b/recursos/comercial/plataforma LaHaus/AJUSTES_CONFIGURACION_JAIDER_2026-10-07.docx
@@ -72,7 +72,7 @@
           <w:i w:val="0"/>
           <w:sz w:val="21"/>
         </w:rPr>
-        <w:t>El decisor ("¿decides tú o consultas?") va dentro de la oferta de cita, no antes. El precio no es un paso del flujo.</w:t>
+        <w:t>El decisor ("¿decides tú o consultas?") va dentro de la oferta de cita, no antes. El precio no es un paso del flujo. Y la secuencia debe poder interrumpirse: si el cliente objeta ("es muy caro") o pregunta precio, el agente responde la objeción y ofrece la cita, no sigue con la siguiente pregunta de la lista.</w:t>
       </w:r>
     </w:p>
     <w:p>
@@ -86,7 +86,7 @@
           <w:color w:val="666666"/>
           <w:sz w:val="19"/>
         </w:rPr>
-        <w:t>Ejemplo: Yarhi (4/10): después de la jornada recibió precio + decisor y se fue sin que le ofrecieran cita. Jaime Pérez (6/10, 7:53 pm): decisor antes de la cita, ya con la base nueva. Henry (6/10, 8:09 pm): igual. Fernanda (7/10, 7:22 pm): soltó los dos precios sin que los pidiera y preguntó el decisor por segunda vez, en tres mensajes en el mismo minuto.</w:t>
+        <w:t>Ejemplo: Yarhi (4/10): después de la jornada recibió precio + decisor y se fue sin que le ofrecieran cita. Jaime Pérez (6/10, 7:53 pm): decisor antes de la cita, ya con la base nueva. Henry (6/10, 8:09 pm): igual. Fernanda (7/10, 7:22 pm): soltó los dos precios sin que los pidiera y preguntó el decisor por segunda vez, en tres mensajes en el mismo minuto. Tilcia (6/10): abrió con "es muy caro el semestre" y el agente arrancó la lista completa (meta, para quién, nivel, jornada, decisor, Cajasan, correo, "¿otro obstáculo?"); ella contestó dos monosílabos y se fue.</w:t>
       </w:r>
     </w:p>
     <w:p>
@@ -579,6 +579,27 @@
           <w:i w:val="0"/>
           <w:sz w:val="21"/>
         </w:rPr>
+        <w:t>Bug de envío:</w:t>
+      </w:r>
+      <w:r>
+        <w:rPr>
+          <w:b w:val="0"/>
+          <w:i w:val="0"/>
+          <w:sz w:val="21"/>
+        </w:rPr>
+        <w:t xml:space="preserve"> a Tilcia (6/10, 3:10 pm) le llegó el mismo mensaje dos veces en el mismo minuto.</w:t>
+      </w:r>
+    </w:p>
+    <w:p>
+      <w:pPr>
+        <w:spacing w:after="120"/>
+      </w:pPr>
+      <w:r>
+        <w:rPr>
+          <w:b/>
+          <w:i w:val="0"/>
+          <w:sz w:val="21"/>
+        </w:rPr>
         <w:t>Pregunta aparte:</w:t>
       </w:r>
       <w:r>

</xml_diff>

<commit_message>
LaHaus Jaider: punto 14 validar campo nombre
</commit_message>
<xml_diff>
--- a/recursos/comercial/plataforma LaHaus/AJUSTES_CONFIGURACION_JAIDER_2026-10-07.docx
+++ b/recursos/comercial/plataforma LaHaus/AJUSTES_CONFIGURACION_JAIDER_2026-10-07.docx
@@ -46,7 +46,7 @@
           <w:i w:val="0"/>
           <w:sz w:val="21"/>
         </w:rPr>
-        <w:t>Jaider, gracias por la reunión. Te dejo por escrito los trece ajustes de configuración, cada uno con el lead donde lo vimos, para que me confirmes fecha de cada uno:</w:t>
+        <w:t>Jaider, gracias por la reunión. Te dejo por escrito los catorce ajustes de configuración, cada uno con el lead donde lo vimos, para que me confirmes fecha de cada uno:</w:t>
       </w:r>
     </w:p>
     <w:p>
@@ -571,6 +571,46 @@
     </w:p>
     <w:p>
       <w:pPr>
+        <w:spacing w:after="20"/>
+      </w:pPr>
+      <w:r>
+        <w:rPr>
+          <w:b/>
+          <w:i w:val="0"/>
+          <w:sz w:val="21"/>
+        </w:rPr>
+        <w:t>14. Validar el campo nombre antes de usarlo.</w:t>
+      </w:r>
+    </w:p>
+    <w:p>
+      <w:pPr>
+        <w:spacing w:after="20"/>
+      </w:pPr>
+      <w:r>
+        <w:rPr>
+          <w:b w:val="0"/>
+          <w:i w:val="0"/>
+          <w:sz w:val="21"/>
+        </w:rPr>
+        <w:t>Si el nombre del contacto tiene "@", números, está vacío o tiene más de tres palabras, el agente saluda sin nombre ("Hola, soy Louissiana…"). Aplica al saludo, a los reintentos y a la plantilla de la llamada. Por nuestro lado, la próxima lista de reactivación va con el campo nombre limpio.</w:t>
+      </w:r>
+    </w:p>
+    <w:p>
+      <w:pPr>
+        <w:spacing w:after="160"/>
+      </w:pPr>
+      <w:r>
+        <w:rPr>
+          <w:b w:val="0"/>
+          <w:i/>
+          <w:color w:val="666666"/>
+          <w:sz w:val="19"/>
+        </w:rPr>
+        <w:t>Ejemplo: Lead del 6/10 1:42 pm: "Hola Marttabuitrago@gmail.com, soy Louissiana…" y al día siguiente "Hola Marttabuitrago@gmail.com. Te llamé hace un momento…".</w:t>
+      </w:r>
+    </w:p>
+    <w:p>
+      <w:pPr>
         <w:spacing w:after="120"/>
       </w:pPr>
       <w:r>

</xml_diff>

<commit_message>
LaHaus Jaider 14: nombres pegados
</commit_message>
<xml_diff>
--- a/recursos/comercial/plataforma LaHaus/AJUSTES_CONFIGURACION_JAIDER_2026-10-07.docx
+++ b/recursos/comercial/plataforma LaHaus/AJUSTES_CONFIGURACION_JAIDER_2026-10-07.docx
@@ -592,7 +592,7 @@
           <w:i w:val="0"/>
           <w:sz w:val="21"/>
         </w:rPr>
-        <w:t>Si el nombre del contacto tiene "@", números, está vacío o tiene más de tres palabras, el agente saluda sin nombre ("Hola, soy Louissiana…"). Aplica al saludo, a los reintentos y a la plantilla de la llamada. Por nuestro lado, la próxima lista de reactivación va con el campo nombre limpio.</w:t>
+        <w:t>Si el nombre del contacto tiene "@", números, está vacío, tiene más de tres palabras o una sola palabra de más de 15 letras (nombre y apellidos pegados), el agente saluda sin nombre ("Hola, soy Louissiana…"). Aplica al saludo, a los reintentos y a la plantilla de la llamada. Por nuestro lado, la próxima lista de reactivación va con el campo nombre limpio.</w:t>
       </w:r>
     </w:p>
     <w:p>
@@ -606,7 +606,7 @@
           <w:color w:val="666666"/>
           <w:sz w:val="19"/>
         </w:rPr>
-        <w:t>Ejemplo: Lead del 6/10 1:42 pm: "Hola Marttabuitrago@gmail.com, soy Louissiana…" y al día siguiente "Hola Marttabuitrago@gmail.com. Te llamé hace un momento…".</w:t>
+        <w:t>Ejemplo: Lead del 6/10 1:42 pm: "Hola Marttabuitrago@gmail.com, soy Louissiana…" y al día siguiente "Hola Marttabuitrago@gmail.com. Te llamé hace un momento…". Yeimi (6/10): "Hola Yeimicarolinajaimesmartin".</w:t>
       </w:r>
     </w:p>
     <w:p>

</xml_diff>

<commit_message>
LaHaus Jaider: puntos 15-16 y 'un asesor te contactara' sin tarea real
</commit_message>
<xml_diff>
--- a/recursos/comercial/plataforma LaHaus/AJUSTES_CONFIGURACION_JAIDER_2026-10-07.docx
+++ b/recursos/comercial/plataforma LaHaus/AJUSTES_CONFIGURACION_JAIDER_2026-10-07.docx
@@ -46,7 +46,7 @@
           <w:i w:val="0"/>
           <w:sz w:val="21"/>
         </w:rPr>
-        <w:t>Jaider, gracias por la reunión. Te dejo por escrito los catorce ajustes de configuración, cada uno con el lead donde lo vimos, para que me confirmes fecha de cada uno:</w:t>
+        <w:t>Jaider, gracias por la reunión. Te dejo por escrito los dieciséis ajustes de configuración, cada uno con el lead donde lo vimos, para que me confirmes fecha de cada uno:</w:t>
       </w:r>
     </w:p>
     <w:p>
@@ -232,7 +232,7 @@
           <w:i w:val="0"/>
           <w:sz w:val="21"/>
         </w:rPr>
-        <w:t>Disparadores: segunda pregunta de precio; cualquier pregunta de mensualidad; "quiero hablar con una persona"; y cierres como "no por ahora", "no tengo el dinero", "me queda alta la cuota", "gracias por la información", "yo te confirmo". El agente responde una línea y no cierra la conversación.</w:t>
+        <w:t>Disparadores: segunda pregunta de precio; cualquier pregunta de mensualidad; "quiero hablar con una persona"; y cierres como "no por ahora", "no tengo el dinero", "me queda alta la cuota", "gracias por la información", "yo te confirmo". El agente responde una línea y no cierra la conversación. Y la frase "un asesor te va a contactar" solo puede salir si crea una tarea real para la asesora; hoy el agente la dice y no pasa nada (Elis, 7/10: la dijo dos veces, la conversación sigue en Agendando y nadie recibió nada).</w:t>
       </w:r>
     </w:p>
     <w:p>
@@ -611,6 +611,86 @@
     </w:p>
     <w:p>
       <w:pPr>
+        <w:spacing w:after="20"/>
+      </w:pPr>
+      <w:r>
+        <w:rPr>
+          <w:b/>
+          <w:i w:val="0"/>
+          <w:sz w:val="21"/>
+        </w:rPr>
+        <w:t>15. La plantilla "¿seguimos por aquí o hacemos una llamada?" no puede saltar directo a agendar.</w:t>
+      </w:r>
+    </w:p>
+    <w:p>
+      <w:pPr>
+        <w:spacing w:after="20"/>
+      </w:pPr>
+      <w:r>
+        <w:rPr>
+          <w:b w:val="0"/>
+          <w:i w:val="0"/>
+          <w:sz w:val="21"/>
+        </w:rPr>
+        <w:t>Si el cliente elige llamada, el agente primero da una línea de contexto (academia de inglés presencial en Bucaramanga, garantía por escrito) y hace la pregunta del motivo; la llamada se agenda después de perfilar, igual que en chat.</w:t>
+      </w:r>
+    </w:p>
+    <w:p>
+      <w:pPr>
+        <w:spacing w:after="160"/>
+      </w:pPr>
+      <w:r>
+        <w:rPr>
+          <w:b w:val="0"/>
+          <w:i/>
+          <w:color w:val="666666"/>
+          <w:sz w:val="19"/>
+        </w:rPr>
+        <w:t>Ejemplo: Elis (7/10, Au Pair): dijo "una llamada" y recibió horas de una vez; preguntó dos veces "¿pero esto qué es?" y el agente siguió ofreciendo franjas. Se fue.</w:t>
+      </w:r>
+    </w:p>
+    <w:p>
+      <w:pPr>
+        <w:spacing w:after="20"/>
+      </w:pPr>
+      <w:r>
+        <w:rPr>
+          <w:b/>
+          <w:i w:val="0"/>
+          <w:sz w:val="21"/>
+        </w:rPr>
+        <w:t>16. Una franja ofrecida debe quedar reservada mientras el cliente responde (2-3 minutos).</w:t>
+      </w:r>
+    </w:p>
+    <w:p>
+      <w:pPr>
+        <w:spacing w:after="20"/>
+      </w:pPr>
+      <w:r>
+        <w:rPr>
+          <w:b w:val="0"/>
+          <w:i w:val="0"/>
+          <w:sz w:val="21"/>
+        </w:rPr>
+        <w:t>Si no es posible, revisar si el "ya se ocupó" fue real: ofrecer una hora y retirarla un minuto después, cuando el cliente ya dudaba, hace quedar al agente como poco confiable.</w:t>
+      </w:r>
+    </w:p>
+    <w:p>
+      <w:pPr>
+        <w:spacing w:after="160"/>
+      </w:pPr>
+      <w:r>
+        <w:rPr>
+          <w:b w:val="0"/>
+          <w:i/>
+          <w:color w:val="666666"/>
+          <w:sz w:val="19"/>
+        </w:rPr>
+        <w:t>Ejemplo: Elis (7/10): el agente ofreció 12:00 o 12:30; ella contestó "12" a los 60 segundos y el agente respondió que las 12:00 "ya se ocuparon".</w:t>
+      </w:r>
+    </w:p>
+    <w:p>
+      <w:pPr>
         <w:spacing w:after="120"/>
       </w:pPr>
       <w:r>

</xml_diff>

<commit_message>
LaHaus: notificaciones deben salir de la plataforma; barrido incluye filtro contacto humano
</commit_message>
<xml_diff>
--- a/recursos/comercial/plataforma LaHaus/AJUSTES_CONFIGURACION_JAIDER_2026-10-07.docx
+++ b/recursos/comercial/plataforma LaHaus/AJUSTES_CONFIGURACION_JAIDER_2026-10-07.docx
@@ -46,7 +46,7 @@
           <w:i w:val="0"/>
           <w:sz w:val="21"/>
         </w:rPr>
-        <w:t>Jaider, gracias por la reunión. Te dejo por escrito los dieciséis ajustes de configuración, cada uno con el lead donde lo vimos, para que me confirmes fecha de cada uno:</w:t>
+        <w:t>Jaider, gracias por la reunión. Te dejo por escrito los nueve ajustes de configuración, cada uno con el lead donde lo vimos, para que me confirmes fecha de cada uno:</w:t>
       </w:r>
     </w:p>
     <w:p>
@@ -72,7 +72,7 @@
           <w:i w:val="0"/>
           <w:sz w:val="21"/>
         </w:rPr>
-        <w:t>El decisor ("¿decides tú o consultas?") va dentro de la oferta de cita, no antes. El precio no es un paso del flujo. Y la secuencia debe poder interrumpirse: si el cliente objeta ("es muy caro") o pregunta precio, el agente responde la objeción y ofrece la cita, no sigue con la siguiente pregunta de la lista.</w:t>
+        <w:t>El decisor ("¿decides tú o consultas?") va dentro de la oferta de cita, no antes. El precio no es un paso del flujo.</w:t>
       </w:r>
     </w:p>
     <w:p>
@@ -86,7 +86,7 @@
           <w:color w:val="666666"/>
           <w:sz w:val="19"/>
         </w:rPr>
-        <w:t>Ejemplo: Yarhi (4/10): después de la jornada recibió precio + decisor y se fue sin que le ofrecieran cita. Jaime Pérez (6/10, 7:53 pm): decisor antes de la cita, ya con la base nueva. Henry (6/10, 8:09 pm): igual. Fernanda (7/10, 7:22 pm): soltó los dos precios sin que los pidiera y preguntó el decisor por segunda vez, en tres mensajes en el mismo minuto. Tilcia (6/10): abrió con "es muy caro el semestre" y el agente arrancó la lista completa (meta, para quién, nivel, jornada, decisor, Cajasan, correo, "¿otro obstáculo?"); ella contestó dos monosílabos y se fue.</w:t>
+        <w:t>Ejemplo: Yarhi (4/10): después de la jornada recibió precio + decisor y se fue sin que le ofrecieran cita. Jaime Pérez (6/10, 7:53 pm): decisor antes de la cita, ya con la base nueva. Henry (6/10, 8:09 pm): igual. Fernanda (7/10, 7:22 pm): soltó los dos precios sin que los pidiera y preguntó el decisor por segunda vez, en tres mensajes en el mismo minuto.</w:t>
       </w:r>
     </w:p>
     <w:p>
@@ -192,7 +192,7 @@
           <w:i w:val="0"/>
           <w:sz w:val="21"/>
         </w:rPr>
-        <w:t>Cadencia única y escrita para lead nuevo: 10 min, 1 h, 4 h, mañana siguiente, tarde siguiente (hoy varía de un lead a otro: a unos cada 5 minutos, a otros cada 35). Reactivación: máximo 2 en 48 horas y 1 a los 7 días. Cuando el cliente responde, el contador se reinicia.</w:t>
+        <w:t>Los 5 toques en 24 horas para lead nuevo están bien. Reactivación: máximo 2 en 48 horas y 1 a los 7 días. Cuando el cliente responde, el contador se reinicia.</w:t>
       </w:r>
     </w:p>
     <w:p>
@@ -232,7 +232,7 @@
           <w:i w:val="0"/>
           <w:sz w:val="21"/>
         </w:rPr>
-        <w:t>Disparadores: segunda pregunta de precio; cualquier pregunta de mensualidad; "quiero hablar con una persona"; y cierres como "no por ahora", "no tengo el dinero", "me queda alta la cuota", "gracias por la información", "yo te confirmo". El agente responde una línea y no cierra la conversación. Y la frase "un asesor te va a contactar" solo puede salir si crea una tarea real para la asesora; hoy el agente la dice y no pasa nada (Elis, 7/10: la dijo dos veces, la conversación sigue en Agendando y nadie recibió nada).</w:t>
+        <w:t>Disparadores: segunda pregunta de precio; cualquier pregunta de mensualidad; "quiero hablar con una persona"; y cierres como "no por ahora", "no tengo el dinero", "me queda alta la cuota", "gracias por la información", "yo te confirmo". El agente responde una línea y no cierra la conversación.</w:t>
       </w:r>
     </w:p>
     <w:p>
@@ -407,307 +407,6 @@
           <w:sz w:val="19"/>
         </w:rPr>
         <w:t>Ejemplo: Lead del 7/10: escribió "quiero reforzar lo que ya sé" (es para él y tiene nivel) y el agente le preguntó "¿el curso es para ti o para alguien más?".</w:t>
-      </w:r>
-    </w:p>
-    <w:p>
-      <w:pPr>
-        <w:spacing w:after="20"/>
-      </w:pPr>
-      <w:r>
-        <w:rPr>
-          <w:b/>
-          <w:i w:val="0"/>
-          <w:sz w:val="21"/>
-        </w:rPr>
-        <w:t>10. La línea de rescate es un estado de entrega: notificación a la asesora y el agente se detiene.</w:t>
-      </w:r>
-    </w:p>
-    <w:p>
-      <w:pPr>
-        <w:spacing w:after="20"/>
-      </w:pPr>
-      <w:r>
-        <w:rPr>
-          <w:b w:val="0"/>
-          <w:i w:val="0"/>
-          <w:sz w:val="21"/>
-        </w:rPr>
-        <w:t>Cuando el agente responde "Te entiendo. Déjame que la asesora te escriba hoy…", no debe seguir con más preguntas ni ofertas hasta que la asesora actúe o el cliente escriba. Y la pausa manual del agente debe ser definitiva hasta que un humano la levante: con Jerson (6/10) el agente se pausó a las 10:11 y a las 10:46 ya estaba preguntando por Cajasan y ofreciendo una llamada.</w:t>
-      </w:r>
-    </w:p>
-    <w:p>
-      <w:pPr>
-        <w:spacing w:after="160"/>
-      </w:pPr>
-      <w:r>
-        <w:rPr>
-          <w:b w:val="0"/>
-          <w:i/>
-          <w:color w:val="666666"/>
-          <w:sz w:val="19"/>
-        </w:rPr>
-        <w:t>Ejemplo: María Eugenia (lead, 7/10 12:34 pm): dijo la línea de rescate y después mandó cinco mensajes más en seis horas (correo, Arranque, Cajasan, "¿te gustaría saber…?").</w:t>
-      </w:r>
-    </w:p>
-    <w:p>
-      <w:pPr>
-        <w:spacing w:after="20"/>
-      </w:pPr>
-      <w:r>
-        <w:rPr>
-          <w:b/>
-          <w:i w:val="0"/>
-          <w:sz w:val="21"/>
-        </w:rPr>
-        <w:t>11. Plantillas: el correo no puede pedirse con "para dejar tu registro al día"; el nombre se pide como primer nombre, no "nombre completo"; y la confirmación de una cita por llamada o videollamada no puede decir "¡Nos vemos!" ni "Te esperamos".</w:t>
-      </w:r>
-    </w:p>
-    <w:p>
-      <w:pPr>
-        <w:spacing w:after="20"/>
-      </w:pPr>
-      <w:r>
-        <w:rPr>
-          <w:b w:val="0"/>
-          <w:i w:val="0"/>
-          <w:sz w:val="21"/>
-        </w:rPr>
-        <w:t>La frase del correo está prohibida desde el 30/09 y no está en nuestro documento: vive en la plantilla de la plataforma; el correo se pide solo al confirmar la cita, con su razón real. La plantilla del nombre pregunta "¿cuál es tu nombre completo?" y luego el agente usa el nombre completo en cada mensaje; debe ser solo el primer nombre.</w:t>
-      </w:r>
-    </w:p>
-    <w:p>
-      <w:pPr>
-        <w:spacing w:after="160"/>
-      </w:pPr>
-      <w:r>
-        <w:rPr>
-          <w:b w:val="0"/>
-          <w:i/>
-          <w:color w:val="666666"/>
-          <w:sz w:val="19"/>
-        </w:rPr>
-        <w:t>Ejemplo: María Eugenia (lead, 7/10 12:28 pm) y varios más esta semana. Laura (6/10): "¿cuál es tu nombre completo?" y después "Laura Alejandra Guarin" en tres mensajes. Vanesa Celis (7/10): cita por LLAMADA confirmada con "¡Nos vemos!" y "Te esperamos".</w:t>
-      </w:r>
-    </w:p>
-    <w:p>
-      <w:pPr>
-        <w:spacing w:after="20"/>
-      </w:pPr>
-      <w:r>
-        <w:rPr>
-          <w:b/>
-          <w:i w:val="0"/>
-          <w:sz w:val="21"/>
-        </w:rPr>
-        <w:t>12. Agrupar los mensajes que el cliente manda en ráfaga y responder una sola vez.</w:t>
-      </w:r>
-    </w:p>
-    <w:p>
-      <w:pPr>
-        <w:spacing w:after="20"/>
-      </w:pPr>
-      <w:r>
-        <w:rPr>
-          <w:b w:val="0"/>
-          <w:i w:val="0"/>
-          <w:sz w:val="21"/>
-        </w:rPr>
-        <w:t>Muchos clientes escriben en fragmentos (tres o cuatro mensajes en el mismo minuto). El agente debería esperar 20-30 segundos y responder a todo junto; hoy contesta cada fragmento por separado y repite preguntas.</w:t>
-      </w:r>
-    </w:p>
-    <w:p>
-      <w:pPr>
-        <w:spacing w:after="160"/>
-      </w:pPr>
-      <w:r>
-        <w:rPr>
-          <w:b w:val="0"/>
-          <w:i/>
-          <w:color w:val="666666"/>
-          <w:sz w:val="19"/>
-        </w:rPr>
-        <w:t>Ejemplo: Sandra (7/10, 5:15-5:18 pm): fragmentos "Un viaje" / "Mi hija va a estudiar…" / "Quiero saber q costo tiene"; el agente mandó dos respuestas por minuto y preguntó la jornada tres veces. (Aun así agendó: viernes 9/10 11:00 am.)</w:t>
-      </w:r>
-    </w:p>
-    <w:p>
-      <w:pPr>
-        <w:spacing w:after="20"/>
-      </w:pPr>
-      <w:r>
-        <w:rPr>
-          <w:b/>
-          <w:i w:val="0"/>
-          <w:sz w:val="21"/>
-        </w:rPr>
-        <w:t>13. Recordatorios de cita: dos como máximo, y ninguno antes de 12 horas después de agendar.</w:t>
-      </w:r>
-    </w:p>
-    <w:p>
-      <w:pPr>
-        <w:spacing w:after="20"/>
-      </w:pPr>
-      <w:r>
-        <w:rPr>
-          <w:b w:val="0"/>
-          <w:i w:val="0"/>
-          <w:sz w:val="21"/>
-        </w:rPr>
-        <w:t>Uno la noche anterior a las 7:00 pm (solo si la cita se agendó antes de ese día) y uno 60 minutos antes, con el enlace de la videollamada o "te llamamos a este número". Si la cita se agenda hoy para mañana, solo el de los 60 minutos.</w:t>
-      </w:r>
-    </w:p>
-    <w:p>
-      <w:pPr>
-        <w:spacing w:after="160"/>
-      </w:pPr>
-      <w:r>
-        <w:rPr>
-          <w:b w:val="0"/>
-          <w:i/>
-          <w:color w:val="666666"/>
-          <w:sz w:val="19"/>
-        </w:rPr>
-        <w:t>Ejemplo: Vanesa Celis (7/10): agendó a las 2:38 pm para el jueves 4:30 pm y a las 4:32 pm le llegó "tu asesor tiene todo listo… ¿todo bien de tu parte?", dos horas después de decir "ok" dos veces.</w:t>
-      </w:r>
-    </w:p>
-    <w:p>
-      <w:pPr>
-        <w:spacing w:after="20"/>
-      </w:pPr>
-      <w:r>
-        <w:rPr>
-          <w:b/>
-          <w:i w:val="0"/>
-          <w:sz w:val="21"/>
-        </w:rPr>
-        <w:t>14. Validar el campo nombre antes de usarlo.</w:t>
-      </w:r>
-    </w:p>
-    <w:p>
-      <w:pPr>
-        <w:spacing w:after="20"/>
-      </w:pPr>
-      <w:r>
-        <w:rPr>
-          <w:b w:val="0"/>
-          <w:i w:val="0"/>
-          <w:sz w:val="21"/>
-        </w:rPr>
-        <w:t>Si el nombre del contacto tiene "@", números, está vacío, tiene más de tres palabras o una sola palabra de más de 15 letras (nombre y apellidos pegados), el agente saluda sin nombre ("Hola, soy Louissiana…"). Si es válido, usa solo el primer nombre con mayúscula inicial (llegó "valentina Martínez" y así lo repitió). Aplica al saludo, a los reintentos y a la plantilla de la llamada. Por nuestro lado, la próxima lista de reactivación va con el campo nombre limpio.</w:t>
-      </w:r>
-    </w:p>
-    <w:p>
-      <w:pPr>
-        <w:spacing w:after="160"/>
-      </w:pPr>
-      <w:r>
-        <w:rPr>
-          <w:b w:val="0"/>
-          <w:i/>
-          <w:color w:val="666666"/>
-          <w:sz w:val="19"/>
-        </w:rPr>
-        <w:t>Ejemplo: Lead del 6/10 1:42 pm: "Hola Marttabuitrago@gmail.com, soy Louissiana…" y al día siguiente "Hola Marttabuitrago@gmail.com. Te llamé hace un momento…". Yeimi (6/10): "Hola Yeimicarolinajaimesmartin".</w:t>
-      </w:r>
-    </w:p>
-    <w:p>
-      <w:pPr>
-        <w:spacing w:after="20"/>
-      </w:pPr>
-      <w:r>
-        <w:rPr>
-          <w:b/>
-          <w:i w:val="0"/>
-          <w:sz w:val="21"/>
-        </w:rPr>
-        <w:t>15. La plantilla "¿seguimos por aquí o hacemos una llamada?" no puede saltar directo a agendar.</w:t>
-      </w:r>
-    </w:p>
-    <w:p>
-      <w:pPr>
-        <w:spacing w:after="20"/>
-      </w:pPr>
-      <w:r>
-        <w:rPr>
-          <w:b w:val="0"/>
-          <w:i w:val="0"/>
-          <w:sz w:val="21"/>
-        </w:rPr>
-        <w:t>Si el cliente elige llamada, el agente primero da una línea de contexto (academia de inglés presencial en Bucaramanga, garantía por escrito) y hace la pregunta del motivo; la llamada se agenda después de perfilar, igual que en chat.</w:t>
-      </w:r>
-    </w:p>
-    <w:p>
-      <w:pPr>
-        <w:spacing w:after="160"/>
-      </w:pPr>
-      <w:r>
-        <w:rPr>
-          <w:b w:val="0"/>
-          <w:i/>
-          <w:color w:val="666666"/>
-          <w:sz w:val="19"/>
-        </w:rPr>
-        <w:t>Ejemplo: Elis (7/10, Au Pair): dijo "una llamada" y recibió horas de una vez; preguntó dos veces "¿pero esto qué es?" y el agente siguió ofreciendo franjas. Se fue.</w:t>
-      </w:r>
-    </w:p>
-    <w:p>
-      <w:pPr>
-        <w:spacing w:after="20"/>
-      </w:pPr>
-      <w:r>
-        <w:rPr>
-          <w:b/>
-          <w:i w:val="0"/>
-          <w:sz w:val="21"/>
-        </w:rPr>
-        <w:t>16. Una franja ofrecida debe quedar reservada mientras el cliente responde (2-3 minutos).</w:t>
-      </w:r>
-    </w:p>
-    <w:p>
-      <w:pPr>
-        <w:spacing w:after="20"/>
-      </w:pPr>
-      <w:r>
-        <w:rPr>
-          <w:b w:val="0"/>
-          <w:i w:val="0"/>
-          <w:sz w:val="21"/>
-        </w:rPr>
-        <w:t>Si no es posible, revisar si el "ya se ocupó" fue real: ofrecer una hora y retirarla un minuto después, cuando el cliente ya dudaba, hace quedar al agente como poco confiable.</w:t>
-      </w:r>
-    </w:p>
-    <w:p>
-      <w:pPr>
-        <w:spacing w:after="160"/>
-      </w:pPr>
-      <w:r>
-        <w:rPr>
-          <w:b w:val="0"/>
-          <w:i/>
-          <w:color w:val="666666"/>
-          <w:sz w:val="19"/>
-        </w:rPr>
-        <w:t>Ejemplo: Elis (7/10): el agente ofreció 12:00 o 12:30; ella contestó "12" a los 60 segundos y el agente respondió que las 12:00 "ya se ocuparon".</w:t>
-      </w:r>
-    </w:p>
-    <w:p>
-      <w:pPr>
-        <w:spacing w:after="120"/>
-      </w:pPr>
-      <w:r>
-        <w:rPr>
-          <w:b/>
-          <w:i w:val="0"/>
-          <w:sz w:val="21"/>
-        </w:rPr>
-        <w:t>Bug de envío:</w:t>
-      </w:r>
-      <w:r>
-        <w:rPr>
-          <w:b w:val="0"/>
-          <w:i w:val="0"/>
-          <w:sz w:val="21"/>
-        </w:rPr>
-        <w:t xml:space="preserve"> a Tilcia (6/10, 3:10 pm) le llegó el mismo mensaje dos veces en el mismo minuto.</w:t>
       </w:r>
     </w:p>
     <w:p>

</xml_diff>